<commit_message>
template.docx made text on page 2 10.5
</commit_message>
<xml_diff>
--- a/backend/avantgarde/utils/template.docx
+++ b/backend/avantgarde/utils/template.docx
@@ -1,6 +1,6 @@
 
 <file path=word/document.xml><?xml version="1.0" encoding="utf-8"?>
-<w:document xmlns:o="urn:schemas-microsoft-com:office:office" xmlns:r="http://schemas.openxmlformats.org/officeDocument/2006/relationships" xmlns:v="urn:schemas-microsoft-com:vml" xmlns:w="http://schemas.openxmlformats.org/wordprocessingml/2006/main" xmlns:w10="urn:schemas-microsoft-com:office:word" xmlns:wp="http://schemas.openxmlformats.org/drawingml/2006/wordprocessingDrawing" xmlns:wps="http://schemas.microsoft.com/office/word/2010/wordprocessingShape" xmlns:wpg="http://schemas.microsoft.com/office/word/2010/wordprocessingGroup" xmlns:mc="http://schemas.openxmlformats.org/markup-compatibility/2006" xmlns:wp14="http://schemas.microsoft.com/office/word/2010/wordprocessingDrawing" xmlns:w14="http://schemas.microsoft.com/office/word/2010/wordml" xmlns:w15="http://schemas.microsoft.com/office/word/2012/wordml" mc:Ignorable="w14 wp14 w15">
+<w:document xmlns:o="urn:schemas-microsoft-com:office:office" xmlns:r="http://schemas.openxmlformats.org/officeDocument/2006/relationships" xmlns:v="urn:schemas-microsoft-com:vml" xmlns:w="http://schemas.openxmlformats.org/wordprocessingml/2006/main" xmlns:w10="urn:schemas-microsoft-com:office:word" xmlns:wp="http://schemas.openxmlformats.org/drawingml/2006/wordprocessingDrawing" xmlns:pic="http://schemas.openxmlformats.org/drawingml/2006/picture" xmlns:wps="http://schemas.microsoft.com/office/word/2010/wordprocessingShape" xmlns:wpg="http://schemas.microsoft.com/office/word/2010/wordprocessingGroup" xmlns:mc="http://schemas.openxmlformats.org/markup-compatibility/2006" xmlns:wp14="http://schemas.microsoft.com/office/word/2010/wordprocessingDrawing" xmlns:w14="http://schemas.microsoft.com/office/word/2010/wordml" xmlns:w15="http://schemas.microsoft.com/office/word/2012/wordml" mc:Ignorable="w14 wp14 w15">
   <w:body>
     <w:tbl>
       <w:tblPr>
@@ -17,8 +17,8 @@
       </w:tblPr>
       <w:tblGrid>
         <w:gridCol w:w="1868"/>
-        <w:gridCol w:w="3773"/>
-        <w:gridCol w:w="4000"/>
+        <w:gridCol w:w="3772"/>
+        <w:gridCol w:w="4001"/>
       </w:tblGrid>
       <w:tr>
         <w:trPr>
@@ -138,7 +138,7 @@
         </w:tc>
         <w:tc>
           <w:tcPr>
-            <w:tcW w:w="3773" w:type="dxa"/>
+            <w:tcW w:w="3772" w:type="dxa"/>
             <w:tcBorders/>
           </w:tcPr>
           <w:p>
@@ -156,7 +156,7 @@
         </w:tc>
         <w:tc>
           <w:tcPr>
-            <w:tcW w:w="4000" w:type="dxa"/>
+            <w:tcW w:w="4001" w:type="dxa"/>
             <w:tcBorders/>
           </w:tcPr>
           <w:p>
@@ -243,15 +243,7 @@
             </w:pPr>
             <w:r>
               <w:rPr/>
-              <w:t>На  3</w:t>
-            </w:r>
-            <w:r>
-              <w:rPr/>
-              <w:t>4</w:t>
-            </w:r>
-            <w:r>
-              <w:rPr/>
-              <w:t xml:space="preserve">  аркушах</w:t>
+              <w:t>На  34  аркушах</w:t>
             </w:r>
           </w:p>
           <w:p>
@@ -331,10 +323,16 @@
               <w:spacing w:lineRule="auto" w:line="240" w:before="0" w:after="0"/>
               <w:contextualSpacing/>
               <w:jc w:val="left"/>
-              <w:rPr/>
-            </w:pPr>
-            <w:r>
-              <w:rPr/>
+              <w:rPr>
+                <w:sz w:val="21"/>
+                <w:szCs w:val="21"/>
+              </w:rPr>
+            </w:pPr>
+            <w:r>
+              <w:rPr>
+                <w:sz w:val="21"/>
+                <w:szCs w:val="21"/>
+              </w:rPr>
               <w:t>{{ text }}</w:t>
             </w:r>
           </w:p>
@@ -868,7 +866,7 @@
     </w:rPr>
   </w:style>
   <w:style w:type="paragraph" w:styleId="Heading1">
-    <w:name w:val="Heading 1"/>
+    <w:name w:val="heading 1"/>
     <w:basedOn w:val="Normal"/>
     <w:next w:val="Normal"/>
     <w:link w:val="1"/>
@@ -889,7 +887,7 @@
     </w:rPr>
   </w:style>
   <w:style w:type="paragraph" w:styleId="Heading2">
-    <w:name w:val="Heading 2"/>
+    <w:name w:val="heading 2"/>
     <w:basedOn w:val="Normal"/>
     <w:next w:val="Normal"/>
     <w:link w:val="2"/>
@@ -912,7 +910,7 @@
     </w:rPr>
   </w:style>
   <w:style w:type="paragraph" w:styleId="Heading3">
-    <w:name w:val="Heading 3"/>
+    <w:name w:val="heading 3"/>
     <w:basedOn w:val="Normal"/>
     <w:next w:val="Normal"/>
     <w:link w:val="3"/>
@@ -935,7 +933,7 @@
     </w:rPr>
   </w:style>
   <w:style w:type="paragraph" w:styleId="Heading4">
-    <w:name w:val="Heading 4"/>
+    <w:name w:val="heading 4"/>
     <w:basedOn w:val="Normal"/>
     <w:next w:val="Normal"/>
     <w:link w:val="4"/>
@@ -958,7 +956,7 @@
     </w:rPr>
   </w:style>
   <w:style w:type="paragraph" w:styleId="Heading5">
-    <w:name w:val="Heading 5"/>
+    <w:name w:val="heading 5"/>
     <w:basedOn w:val="Normal"/>
     <w:next w:val="Normal"/>
     <w:link w:val="5"/>
@@ -979,7 +977,7 @@
     </w:rPr>
   </w:style>
   <w:style w:type="paragraph" w:styleId="Heading6">
-    <w:name w:val="Heading 6"/>
+    <w:name w:val="heading 6"/>
     <w:basedOn w:val="Normal"/>
     <w:next w:val="Normal"/>
     <w:link w:val="6"/>
@@ -1002,7 +1000,7 @@
     </w:rPr>
   </w:style>
   <w:style w:type="paragraph" w:styleId="Heading7">
-    <w:name w:val="Heading 7"/>
+    <w:name w:val="heading 7"/>
     <w:basedOn w:val="Normal"/>
     <w:next w:val="Normal"/>
     <w:link w:val="7"/>
@@ -1023,7 +1021,7 @@
     </w:rPr>
   </w:style>
   <w:style w:type="paragraph" w:styleId="Heading8">
-    <w:name w:val="Heading 8"/>
+    <w:name w:val="heading 8"/>
     <w:basedOn w:val="Normal"/>
     <w:next w:val="Normal"/>
     <w:link w:val="8"/>
@@ -1046,7 +1044,7 @@
     </w:rPr>
   </w:style>
   <w:style w:type="paragraph" w:styleId="Heading9">
-    <w:name w:val="Heading 9"/>
+    <w:name w:val="heading 9"/>
     <w:basedOn w:val="Normal"/>
     <w:next w:val="Normal"/>
     <w:link w:val="9"/>
@@ -1284,13 +1282,13 @@
       <w:spacing w:val="5"/>
     </w:rPr>
   </w:style>
-  <w:style w:type="character" w:styleId="FootnoteCharacters">
-    <w:name w:val="Footnote Characters"/>
+  <w:style w:type="character" w:styleId="FootnoteCharactersuser">
+    <w:name w:val="Footnote Characters (user)"/>
     <w:qFormat/>
     <w:rPr/>
   </w:style>
-  <w:style w:type="character" w:styleId="EndnoteCharacters">
-    <w:name w:val="Endnote Characters"/>
+  <w:style w:type="character" w:styleId="EndnoteCharactersuser">
+    <w:name w:val="Endnote Characters (user)"/>
     <w:qFormat/>
     <w:rPr/>
   </w:style>
@@ -1340,7 +1338,7 @@
     </w:rPr>
   </w:style>
   <w:style w:type="paragraph" w:styleId="Caption">
-    <w:name w:val="Caption"/>
+    <w:name w:val="caption"/>
     <w:basedOn w:val="Normal"/>
     <w:qFormat/>
     <w:pPr>
@@ -1504,7 +1502,7 @@
     <w:rPr/>
   </w:style>
   <w:style w:type="paragraph" w:styleId="Footer">
-    <w:name w:val="Footer"/>
+    <w:name w:val="footer"/>
     <w:basedOn w:val="HeaderandFooter"/>
     <w:pPr>
       <w:suppressLineNumbers/>

</xml_diff>

<commit_message>
template.docx - fonts, dates and dsk corrected
</commit_message>
<xml_diff>
--- a/backend/avantgarde/utils/template.docx
+++ b/backend/avantgarde/utils/template.docx
@@ -4,9 +4,9 @@
   <w:body>
     <w:tbl>
       <w:tblPr>
-        <w:tblW w:w="9641" w:type="dxa"/>
+        <w:tblW w:w="9564" w:type="dxa"/>
         <w:jc w:val="left"/>
-        <w:tblInd w:w="0" w:type="dxa"/>
+        <w:tblInd w:w="78" w:type="dxa"/>
         <w:tblLayout w:type="fixed"/>
         <w:tblCellMar>
           <w:top w:w="55" w:type="dxa"/>
@@ -16,9 +16,9 @@
         </w:tblCellMar>
       </w:tblPr>
       <w:tblGrid>
-        <w:gridCol w:w="1868"/>
-        <w:gridCol w:w="3772"/>
-        <w:gridCol w:w="4001"/>
+        <w:gridCol w:w="1798"/>
+        <w:gridCol w:w="3398"/>
+        <w:gridCol w:w="4368"/>
       </w:tblGrid>
       <w:tr>
         <w:trPr>
@@ -26,7 +26,7 @@
         </w:trPr>
         <w:tc>
           <w:tcPr>
-            <w:tcW w:w="9641" w:type="dxa"/>
+            <w:tcW w:w="9564" w:type="dxa"/>
             <w:gridSpan w:val="3"/>
             <w:tcBorders/>
           </w:tcPr>
@@ -35,11 +35,15 @@
               <w:pStyle w:val="TableContents"/>
               <w:spacing w:before="0" w:after="160"/>
               <w:jc w:val="right"/>
-              <w:rPr/>
-            </w:pPr>
-            <w:r>
-              <w:rPr/>
-              <w:t>Гриф секретності (обмеження доступу): ДСК</w:t>
+              <w:rPr>
+                <w:rFonts w:ascii="Noto Sans" w:hAnsi="Noto Sans"/>
+              </w:rPr>
+            </w:pPr>
+            <w:r>
+              <w:rPr>
+                <w:rFonts w:ascii="Noto Sans" w:hAnsi="Noto Sans"/>
+              </w:rPr>
+              <w:t>ДЛЯ СЛУЖБОВОГО КОРИСТУВАННЯ</w:t>
             </w:r>
           </w:p>
           <w:p>
@@ -47,10 +51,14 @@
               <w:pStyle w:val="TableContents"/>
               <w:spacing w:before="0" w:after="160"/>
               <w:jc w:val="right"/>
-              <w:rPr/>
-            </w:pPr>
-            <w:r>
-              <w:rPr/>
+              <w:rPr>
+                <w:rFonts w:ascii="Noto Sans" w:hAnsi="Noto Sans"/>
+              </w:rPr>
+            </w:pPr>
+            <w:r>
+              <w:rPr>
+                <w:rFonts w:ascii="Noto Sans" w:hAnsi="Noto Sans"/>
+              </w:rPr>
             </w:r>
           </w:p>
           <w:p>
@@ -58,10 +66,14 @@
               <w:pStyle w:val="TableContents"/>
               <w:spacing w:before="0" w:after="160"/>
               <w:jc w:val="right"/>
-              <w:rPr/>
-            </w:pPr>
-            <w:r>
-              <w:rPr/>
+              <w:rPr>
+                <w:rFonts w:ascii="Noto Sans" w:hAnsi="Noto Sans"/>
+              </w:rPr>
+            </w:pPr>
+            <w:r>
+              <w:rPr>
+                <w:rFonts w:ascii="Noto Sans" w:hAnsi="Noto Sans"/>
+              </w:rPr>
             </w:r>
           </w:p>
         </w:tc>
@@ -72,7 +84,7 @@
         </w:trPr>
         <w:tc>
           <w:tcPr>
-            <w:tcW w:w="9641" w:type="dxa"/>
+            <w:tcW w:w="9564" w:type="dxa"/>
             <w:gridSpan w:val="3"/>
             <w:tcBorders/>
           </w:tcPr>
@@ -80,10 +92,14 @@
             <w:pPr>
               <w:pStyle w:val="Title"/>
               <w:jc w:val="center"/>
-              <w:rPr/>
-            </w:pPr>
-            <w:r>
-              <w:rPr/>
+              <w:rPr>
+                <w:rFonts w:ascii="Noto Sans" w:hAnsi="Noto Sans"/>
+              </w:rPr>
+            </w:pPr>
+            <w:r>
+              <w:rPr>
+                <w:rFonts w:ascii="Noto Sans" w:hAnsi="Noto Sans"/>
+              </w:rPr>
               <w:t>ЖУРНАЛ</w:t>
             </w:r>
           </w:p>
@@ -92,12 +108,13 @@
               <w:pStyle w:val="Heading1"/>
               <w:jc w:val="center"/>
               <w:rPr>
-                <w:color w:val="0F4761"/>
-              </w:rPr>
-            </w:pPr>
-            <w:r>
-              <w:rPr>
-                <w:color w:val="0F4761"/>
+                <w:color w:val="auto"/>
+              </w:rPr>
+            </w:pPr>
+            <w:r>
+              <w:rPr>
+                <w:rFonts w:ascii="Noto Sans" w:hAnsi="Noto Sans"/>
+                <w:color w:val="auto"/>
               </w:rPr>
               <w:t>Авангард во время войны</w:t>
             </w:r>
@@ -107,10 +124,14 @@
               <w:pStyle w:val="Normal"/>
               <w:spacing w:before="0" w:after="160"/>
               <w:jc w:val="center"/>
-              <w:rPr/>
-            </w:pPr>
-            <w:r>
-              <w:rPr/>
+              <w:rPr>
+                <w:rFonts w:ascii="Noto Sans" w:hAnsi="Noto Sans"/>
+              </w:rPr>
+            </w:pPr>
+            <w:r>
+              <w:rPr>
+                <w:rFonts w:ascii="Noto Sans" w:hAnsi="Noto Sans"/>
+              </w:rPr>
               <w:t>Позивний: УЛІС</w:t>
             </w:r>
           </w:p>
@@ -118,27 +139,31 @@
       </w:tr>
       <w:tr>
         <w:trPr>
-          <w:trHeight w:val="2779" w:hRule="atLeast"/>
+          <w:trHeight w:val="2400" w:hRule="atLeast"/>
         </w:trPr>
         <w:tc>
           <w:tcPr>
-            <w:tcW w:w="1868" w:type="dxa"/>
+            <w:tcW w:w="1798" w:type="dxa"/>
             <w:tcBorders/>
           </w:tcPr>
           <w:p>
             <w:pPr>
               <w:pStyle w:val="TableContents"/>
               <w:spacing w:before="0" w:after="160"/>
-              <w:rPr/>
-            </w:pPr>
-            <w:r>
-              <w:rPr/>
+              <w:rPr>
+                <w:rFonts w:ascii="Noto Sans" w:hAnsi="Noto Sans"/>
+              </w:rPr>
+            </w:pPr>
+            <w:r>
+              <w:rPr>
+                <w:rFonts w:ascii="Noto Sans" w:hAnsi="Noto Sans"/>
+              </w:rPr>
             </w:r>
           </w:p>
         </w:tc>
         <w:tc>
           <w:tcPr>
-            <w:tcW w:w="3772" w:type="dxa"/>
+            <w:tcW w:w="3398" w:type="dxa"/>
             <w:tcBorders/>
           </w:tcPr>
           <w:p>
@@ -147,16 +172,20 @@
               <w:widowControl w:val="false"/>
               <w:suppressLineNumbers/>
               <w:spacing w:before="0" w:after="160"/>
-              <w:rPr/>
-            </w:pPr>
-            <w:r>
-              <w:rPr/>
+              <w:rPr>
+                <w:rFonts w:ascii="Noto Sans" w:hAnsi="Noto Sans"/>
+              </w:rPr>
+            </w:pPr>
+            <w:r>
+              <w:rPr>
+                <w:rFonts w:ascii="Noto Sans" w:hAnsi="Noto Sans"/>
+              </w:rPr>
             </w:r>
           </w:p>
         </w:tc>
         <w:tc>
           <w:tcPr>
-            <w:tcW w:w="4001" w:type="dxa"/>
+            <w:tcW w:w="4368" w:type="dxa"/>
             <w:tcBorders/>
           </w:tcPr>
           <w:p>
@@ -165,10 +194,14 @@
               <w:spacing w:lineRule="auto" w:line="240" w:before="0" w:after="0"/>
               <w:contextualSpacing/>
               <w:jc w:val="left"/>
-              <w:rPr/>
-            </w:pPr>
-            <w:r>
-              <w:rPr/>
+              <w:rPr>
+                <w:rFonts w:ascii="Noto Sans" w:hAnsi="Noto Sans"/>
+              </w:rPr>
+            </w:pPr>
+            <w:r>
+              <w:rPr>
+                <w:rFonts w:ascii="Noto Sans" w:hAnsi="Noto Sans"/>
+              </w:rPr>
             </w:r>
           </w:p>
           <w:p>
@@ -177,10 +210,14 @@
               <w:spacing w:lineRule="auto" w:line="240" w:before="0" w:after="0"/>
               <w:contextualSpacing/>
               <w:jc w:val="left"/>
-              <w:rPr/>
-            </w:pPr>
-            <w:r>
-              <w:rPr/>
+              <w:rPr>
+                <w:rFonts w:ascii="Noto Sans" w:hAnsi="Noto Sans"/>
+              </w:rPr>
+            </w:pPr>
+            <w:r>
+              <w:rPr>
+                <w:rFonts w:ascii="Noto Sans" w:hAnsi="Noto Sans"/>
+              </w:rPr>
             </w:r>
           </w:p>
           <w:p>
@@ -189,10 +226,14 @@
               <w:spacing w:lineRule="auto" w:line="240" w:before="0" w:after="0"/>
               <w:contextualSpacing/>
               <w:jc w:val="left"/>
-              <w:rPr/>
-            </w:pPr>
-            <w:r>
-              <w:rPr/>
+              <w:rPr>
+                <w:rFonts w:ascii="Noto Sans" w:hAnsi="Noto Sans"/>
+              </w:rPr>
+            </w:pPr>
+            <w:r>
+              <w:rPr>
+                <w:rFonts w:ascii="Noto Sans" w:hAnsi="Noto Sans"/>
+              </w:rPr>
             </w:r>
           </w:p>
           <w:p>
@@ -201,10 +242,15 @@
               <w:spacing w:lineRule="auto" w:line="240" w:before="0" w:after="0"/>
               <w:contextualSpacing/>
               <w:jc w:val="left"/>
-              <w:rPr/>
-            </w:pPr>
-            <w:r>
-              <w:rPr/>
+              <w:rPr>
+                <w:rFonts w:ascii="Noto Sans" w:hAnsi="Noto Sans"/>
+              </w:rPr>
+            </w:pPr>
+            <w:r>
+              <w:rPr>
+                <w:rFonts w:ascii="Noto Sans" w:hAnsi="Noto Sans"/>
+              </w:rPr>
+              <w:t>Розпочато: 21 квітня 2020 р.</w:t>
             </w:r>
           </w:p>
           <w:p>
@@ -213,11 +259,15 @@
               <w:spacing w:lineRule="auto" w:line="240" w:before="0" w:after="0"/>
               <w:contextualSpacing/>
               <w:jc w:val="left"/>
-              <w:rPr/>
-            </w:pPr>
-            <w:r>
-              <w:rPr/>
-              <w:t>Розпочато: 10 березня 2022 р.</w:t>
+              <w:rPr>
+                <w:rFonts w:ascii="Noto Sans" w:hAnsi="Noto Sans"/>
+              </w:rPr>
+            </w:pPr>
+            <w:r>
+              <w:rPr>
+                <w:rFonts w:ascii="Noto Sans" w:hAnsi="Noto Sans"/>
+              </w:rPr>
+              <w:t>Закінчено: 23 листопада 2040 р.</w:t>
             </w:r>
           </w:p>
           <w:p>
@@ -226,11 +276,15 @@
               <w:spacing w:lineRule="auto" w:line="240" w:before="0" w:after="0"/>
               <w:contextualSpacing/>
               <w:jc w:val="left"/>
-              <w:rPr/>
-            </w:pPr>
-            <w:r>
-              <w:rPr/>
-              <w:t>Закінчено:   5 березня 2040 р.</w:t>
+              <w:rPr>
+                <w:rFonts w:ascii="Noto Sans" w:hAnsi="Noto Sans"/>
+              </w:rPr>
+            </w:pPr>
+            <w:r>
+              <w:rPr>
+                <w:rFonts w:ascii="Noto Sans" w:hAnsi="Noto Sans"/>
+              </w:rPr>
+              <w:t>На  34  аркушах</w:t>
             </w:r>
           </w:p>
           <w:p>
@@ -239,23 +293,14 @@
               <w:spacing w:lineRule="auto" w:line="240" w:before="0" w:after="0"/>
               <w:contextualSpacing/>
               <w:jc w:val="left"/>
-              <w:rPr/>
-            </w:pPr>
-            <w:r>
-              <w:rPr/>
-              <w:t>На  34  аркушах</w:t>
-            </w:r>
-          </w:p>
-          <w:p>
-            <w:pPr>
-              <w:pStyle w:val="TableContents"/>
-              <w:spacing w:lineRule="auto" w:line="240" w:before="0" w:after="0"/>
-              <w:contextualSpacing/>
-              <w:jc w:val="left"/>
-              <w:rPr/>
-            </w:pPr>
-            <w:r>
-              <w:rPr/>
+              <w:rPr>
+                <w:rFonts w:ascii="Noto Sans" w:hAnsi="Noto Sans"/>
+              </w:rPr>
+            </w:pPr>
+            <w:r>
+              <w:rPr>
+                <w:rFonts w:ascii="Noto Sans" w:hAnsi="Noto Sans"/>
+              </w:rPr>
               <w:t>Інв. №  _________</w:t>
             </w:r>
           </w:p>
@@ -267,10 +312,14 @@
         <w:pStyle w:val="BodyText"/>
         <w:spacing w:lineRule="auto" w:line="240" w:before="0" w:after="0"/>
         <w:contextualSpacing/>
-        <w:rPr/>
+        <w:rPr>
+          <w:rFonts w:ascii="Noto Sans" w:hAnsi="Noto Sans"/>
+        </w:rPr>
       </w:pPr>
       <w:r>
-        <w:rPr/>
+        <w:rPr>
+          <w:rFonts w:ascii="Noto Sans" w:hAnsi="Noto Sans"/>
+        </w:rPr>
       </w:r>
     </w:p>
     <w:tbl>
@@ -292,7 +341,7 @@
       </w:tblGrid>
       <w:tr>
         <w:trPr>
-          <w:trHeight w:val="6009" w:hRule="atLeast"/>
+          <w:trHeight w:val="5844" w:hRule="atLeast"/>
         </w:trPr>
         <w:tc>
           <w:tcPr>
@@ -304,10 +353,18 @@
               <w:pStyle w:val="BodyText"/>
               <w:spacing w:lineRule="auto" w:line="240" w:before="0" w:after="0"/>
               <w:contextualSpacing/>
-              <w:rPr/>
-            </w:pPr>
-            <w:r>
-              <w:rPr/>
+              <w:rPr>
+                <w:rFonts w:ascii="Noto Sans" w:hAnsi="Noto Sans"/>
+                <w:sz w:val="20"/>
+                <w:szCs w:val="20"/>
+              </w:rPr>
+            </w:pPr>
+            <w:r>
+              <w:rPr>
+                <w:rFonts w:ascii="Noto Sans" w:hAnsi="Noto Sans"/>
+                <w:sz w:val="20"/>
+                <w:szCs w:val="20"/>
+              </w:rPr>
             </w:r>
           </w:p>
         </w:tc>
@@ -324,14 +381,15 @@
               <w:contextualSpacing/>
               <w:jc w:val="left"/>
               <w:rPr>
-                <w:sz w:val="21"/>
-                <w:szCs w:val="21"/>
-              </w:rPr>
-            </w:pPr>
-            <w:r>
-              <w:rPr>
-                <w:sz w:val="21"/>
-                <w:szCs w:val="21"/>
+                <w:sz w:val="20"/>
+                <w:szCs w:val="20"/>
+              </w:rPr>
+            </w:pPr>
+            <w:r>
+              <w:rPr>
+                <w:rFonts w:ascii="Noto Sans" w:hAnsi="Noto Sans"/>
+                <w:sz w:val="20"/>
+                <w:szCs w:val="20"/>
               </w:rPr>
               <w:t>{{ text }}</w:t>
             </w:r>
@@ -341,25 +399,18 @@
     </w:tbl>
     <w:p>
       <w:pPr>
-        <w:pStyle w:val="Normal"/>
-        <w:spacing w:lineRule="auto" w:line="240" w:before="0" w:after="0"/>
-        <w:contextualSpacing/>
-        <w:rPr/>
-      </w:pPr>
-      <w:r>
-        <w:rPr/>
-      </w:r>
-    </w:p>
-    <w:p>
-      <w:pPr>
         <w:pStyle w:val="BodyText"/>
         <w:spacing w:lineRule="auto" w:line="240" w:before="0" w:after="0"/>
         <w:contextualSpacing/>
-        <w:rPr/>
+        <w:rPr>
+          <w:rFonts w:ascii="Noto Sans" w:hAnsi="Noto Sans"/>
+        </w:rPr>
       </w:pPr>
       <w:r>
-        <w:rPr/>
-        <w:t>{% for row in rows %}</w:t>
+        <w:rPr>
+          <w:rFonts w:ascii="Noto Sans" w:hAnsi="Noto Sans"/>
+        </w:rPr>
+        <w:t>{%p for row in rows %}</w:t>
       </w:r>
     </w:p>
     <w:tbl>
@@ -381,7 +432,7 @@
       </w:tblGrid>
       <w:tr>
         <w:trPr>
-          <w:trHeight w:val="6009" w:hRule="atLeast"/>
+          <w:trHeight w:val="5664" w:hRule="atLeast"/>
         </w:trPr>
         <w:tc>
           <w:tcPr>
@@ -393,10 +444,14 @@
               <w:pStyle w:val="BodyText"/>
               <w:spacing w:lineRule="auto" w:line="240" w:before="0" w:after="0"/>
               <w:contextualSpacing/>
-              <w:rPr/>
-            </w:pPr>
-            <w:r>
-              <w:rPr/>
+              <w:rPr>
+                <w:rFonts w:ascii="Noto Sans" w:hAnsi="Noto Sans"/>
+              </w:rPr>
+            </w:pPr>
+            <w:r>
+              <w:rPr>
+                <w:rFonts w:ascii="Noto Sans" w:hAnsi="Noto Sans"/>
+              </w:rPr>
             </w:r>
           </w:p>
         </w:tc>
@@ -412,10 +467,14 @@
               <w:spacing w:lineRule="auto" w:line="240" w:before="0" w:after="0"/>
               <w:contextualSpacing/>
               <w:jc w:val="center"/>
-              <w:rPr/>
-            </w:pPr>
-            <w:r>
-              <w:rPr/>
+              <w:rPr>
+                <w:rFonts w:ascii="Noto Sans" w:hAnsi="Noto Sans"/>
+              </w:rPr>
+            </w:pPr>
+            <w:r>
+              <w:rPr>
+                <w:rFonts w:ascii="Noto Sans" w:hAnsi="Noto Sans"/>
+              </w:rPr>
               <w:t>{{ row.img1 }}</w:t>
             </w:r>
           </w:p>
@@ -428,11 +487,35 @@
         <w:spacing w:lineRule="auto" w:line="240" w:before="0" w:after="0"/>
         <w:ind w:hanging="0" w:left="0" w:right="0"/>
         <w:contextualSpacing/>
-        <w:rPr/>
+        <w:rPr>
+          <w:rFonts w:ascii="Noto Sans" w:hAnsi="Noto Sans"/>
+        </w:rPr>
       </w:pPr>
       <w:r>
-        <w:rPr/>
-        <w:t>{% endfor %}</w:t>
+        <w:rPr>
+          <w:rFonts w:ascii="Noto Sans" w:hAnsi="Noto Sans"/>
+        </w:rPr>
+        <w:t>{%p endfor %}</w:t>
+      </w:r>
+      <w:r>
+        <w:br w:type="page"/>
+      </w:r>
+    </w:p>
+    <w:p>
+      <w:pPr>
+        <w:pStyle w:val="BodyText"/>
+        <w:spacing w:lineRule="auto" w:line="240" w:before="0" w:after="0"/>
+        <w:ind w:hanging="0" w:left="0" w:right="0"/>
+        <w:contextualSpacing/>
+        <w:rPr>
+          <w:rFonts w:ascii="Noto Sans" w:hAnsi="Noto Sans"/>
+        </w:rPr>
+      </w:pPr>
+      <w:r>
+        <w:rPr>
+          <w:rFonts w:ascii="Noto Sans" w:hAnsi="Noto Sans"/>
+        </w:rPr>
+        <w:t> </w:t>
       </w:r>
     </w:p>
     <w:sectPr>
@@ -1282,13 +1365,13 @@
       <w:spacing w:val="5"/>
     </w:rPr>
   </w:style>
-  <w:style w:type="character" w:styleId="FootnoteCharactersuser">
-    <w:name w:val="Footnote Characters (user)"/>
+  <w:style w:type="character" w:styleId="FootnoteCharacters">
+    <w:name w:val="Footnote Characters"/>
     <w:qFormat/>
     <w:rPr/>
   </w:style>
-  <w:style w:type="character" w:styleId="EndnoteCharactersuser">
-    <w:name w:val="Endnote Characters (user)"/>
+  <w:style w:type="character" w:styleId="EndnoteCharacters">
+    <w:name w:val="Endnote Characters"/>
     <w:qFormat/>
     <w:rPr/>
   </w:style>

</xml_diff>

<commit_message>
added blank page at the end in LibreOffice
</commit_message>
<xml_diff>
--- a/backend/avantgarde/utils/template.docx
+++ b/backend/avantgarde/utils/template.docx
@@ -515,7 +515,25 @@
         <w:rPr>
           <w:rFonts w:ascii="Noto Sans" w:hAnsi="Noto Sans"/>
         </w:rPr>
-        <w:t> </w:t>
+      </w:r>
+      <w:r>
+        <w:br w:type="page"/>
+      </w:r>
+    </w:p>
+    <w:p>
+      <w:pPr>
+        <w:pStyle w:val="BodyText"/>
+        <w:spacing w:lineRule="auto" w:line="240" w:before="0" w:after="0"/>
+        <w:ind w:hanging="0" w:left="0" w:right="0"/>
+        <w:contextualSpacing/>
+        <w:rPr>
+          <w:rFonts w:ascii="Noto Sans" w:hAnsi="Noto Sans"/>
+        </w:rPr>
+      </w:pPr>
+      <w:r>
+        <w:rPr>
+          <w:rFonts w:ascii="Noto Sans" w:hAnsi="Noto Sans"/>
+        </w:rPr>
       </w:r>
     </w:p>
     <w:sectPr>

</xml_diff>